<commit_message>
How to play in the app, on the ruled draft: an index and ten sections behind two doors, 84 catalogue entries with the numbers a difficulty sets read from the content pack and section 3's example row composed as the inspect sheet composes it; section 9's names and reasons from the event table the reveal renders, its effect lines pinned to the engine by firing each event (two controls), and two lines emptied because Kartik's reasons already state the effect; the rulebook and quick reference corrected in place (NK reach within 1 step; the third phase Spread); the audit walking all twelve Help screens
Co-Authored-By: Claude Fable 5.1 <noreply@anthropic.com>
</commit_message>
<xml_diff>
--- a/docs/Immunity_Wars_Quick_Reference_v3.docx
+++ b/docs/Immunity_Wars_Quick_Reference_v3.docx
@@ -185,7 +185,7 @@
           <w:sz w:val="18"/>
           <w:szCs w:val="18"/>
         </w:rPr>
-        <w:t xml:space="preserve">3 · MARCH  </w:t>
+        <w:t xml:space="preserve">3 · SPREAD  </w:t>
       </w:r>
       <w:r>
         <w:rPr>
@@ -904,7 +904,7 @@
                 <w:sz w:val="17"/>
                 <w:szCs w:val="17"/>
               </w:rPr>
-              <w:t xml:space="preserve">Kill (1 AP) — attacks a hidden or infected cell on a die roll of 3+. Needs no antigen and no antibody.</w:t>
+              <w:t xml:space="preserve">Kill (1 AP) — attacks a hidden or infected cell within 1 step, on a die roll of 3+. Needs no antigen and no antibody.</w:t>
             </w:r>
           </w:p>
         </w:tc>

</xml_diff>